<commit_message>
feat: apply F-004/F-005 — USA panel in DF, replacement-not-unique caveat, visual-complexity note in CC
DF: plain (four-encoding) USA composite embedded alongside Norway; passage
clarifying Norway/USA were the named exceptions as rich-world RECOVERIES,
not the only replacement populations. CC: note framing the ceiling as a
fifth encoding / third reading of one field, deliberately confined to CC
for accessibility (per Jon's uptake concern about 4D+ figures). Feedback
register and revision checklists updated; workplan gains the candidate
global 'universality test' manuscript. Combined CSV remains deliberately
uncommitted pending HFD-terms decision.

Co-Authored-By: Claude Fable 5 <noreply@anthropic.com>
</commit_message>
<xml_diff>
--- a/manuscript_2026/descriptive_finding.docx
+++ b/manuscript_2026/descriptive_finding.docx
@@ -851,7 +851,7 @@
       </w:r>
     </w:p>
     <w:bookmarkEnd w:id="16"/>
-    <w:bookmarkStart w:id="28" w:name="results"/>
+    <w:bookmarkStart w:id="32" w:name="results"/>
     <w:p>
       <w:pPr>
         <w:pStyle w:val="Heading1"/>
@@ -1040,110 +1040,13 @@
       </w:r>
     </w:p>
     <w:bookmarkEnd w:id="21"/>
-    <w:bookmarkStart w:id="22" w:name="united-states"/>
+    <w:bookmarkStart w:id="26" w:name="united-states"/>
     <w:p>
       <w:pPr>
         <w:pStyle w:val="Heading2"/>
       </w:pPr>
       <w:r>
         <w:t xml:space="preserve">United States</w:t>
-      </w:r>
-    </w:p>
-    <w:p>
-      <w:pPr>
-        <w:pStyle w:val="FirstParagraph"/>
-      </w:pPr>
-      <w:r>
-        <w:t xml:space="preserve">The United States requires a more careful statement. Its period TFR fell from</w:t>
-      </w:r>
-      <w:r>
-        <w:t xml:space="preserve"> </w:t>
-      </w:r>
-      <w:r>
-        <w:t xml:space="preserve">2.12 (2007) to 1.59 (2024), a record low. In cohort terms, however, the</w:t>
-      </w:r>
-      <w:r>
-        <w:t xml:space="preserve"> </w:t>
-      </w:r>
-      <w:r>
-        <w:t xml:space="preserve">exception</w:t>
-      </w:r>
-      <w:r>
-        <w:t xml:space="preserve"> </w:t>
-      </w:r>
-      <w:r>
-        <w:rPr>
-          <w:i/>
-          <w:iCs/>
-        </w:rPr>
-        <w:t xml:space="preserve">persisted</w:t>
-      </w:r>
-      <w:r>
-        <w:t xml:space="preserve"> </w:t>
-      </w:r>
-      <w:r>
-        <w:t xml:space="preserve">longer than the period collapse suggests: cohorts born</w:t>
-      </w:r>
-      <w:r>
-        <w:t xml:space="preserve"> </w:t>
-      </w:r>
-      <w:r>
-        <w:t xml:space="preserve">1982, 1983 and 1984 all crossed CPCFR = 2.05, at ages 39, 39 and 40</w:t>
-      </w:r>
-      <w:r>
-        <w:t xml:space="preserve"> </w:t>
-      </w:r>
-      <w:r>
-        <w:t xml:space="preserve">respectively, with completed cumulative fertility of 2.14, 2.13 and 2.09. The</w:t>
-      </w:r>
-      <w:r>
-        <w:t xml:space="preserve"> </w:t>
-      </w:r>
-      <w:r>
-        <w:t xml:space="preserve">1985 cohort stood at 2.04 by age 39 (data to 2024) and will plausibly cross;</w:t>
-      </w:r>
-      <w:r>
-        <w:t xml:space="preserve"> </w:t>
-      </w:r>
-      <w:r>
-        <w:t xml:space="preserve">trajectories for cohorts born after the mid-1980s run progressively lower at</w:t>
-      </w:r>
-      <w:r>
-        <w:t xml:space="preserve"> </w:t>
-      </w:r>
-      <w:r>
-        <w:t xml:space="preserve">every age but remain right-censored. The US exception has thus not yet</w:t>
-      </w:r>
-      <w:r>
-        <w:t xml:space="preserve"> </w:t>
-      </w:r>
-      <w:r>
-        <w:t xml:space="preserve">collapsed in cohort terms; it is fading from below, cohort by cohort, exactly</w:t>
-      </w:r>
-      <w:r>
-        <w:t xml:space="preserve"> </w:t>
-      </w:r>
-      <w:r>
-        <w:t xml:space="preserve">as the period-based literature on postponement would predict</w:t>
-      </w:r>
-      <w:r>
-        <w:t xml:space="preserve"> </w:t>
-      </w:r>
-      <w:r>
-        <w:t xml:space="preserve">(Sobotka 2017; Kearney et al. 2022)</w:t>
-      </w:r>
-      <w:r>
-        <w:t xml:space="preserve">.</w:t>
-      </w:r>
-    </w:p>
-    <w:bookmarkEnd w:id="22"/>
-    <w:bookmarkStart w:id="27" w:name="the-panel-as-a-whole"/>
-    <w:p>
-      <w:pPr>
-        <w:pStyle w:val="Heading2"/>
-      </w:pPr>
-      <w:r>
-        <w:t xml:space="preserve">The panel as a whole</w:t>
       </w:r>
     </w:p>
     <w:tbl>
@@ -1159,7 +1062,7 @@
       <w:tr>
         <w:tc>
           <w:tcPr/>
-          <w:bookmarkStart w:id="26" w:name="fig-top15"/>
+          <w:bookmarkStart w:id="25" w:name="fig-usa"/>
           <w:p>
             <w:pPr>
               <w:pStyle w:val="Compact"/>
@@ -1168,20 +1071,207 @@
             <w:r>
               <w:drawing>
                 <wp:inline>
-                  <wp:extent cx="5334000" cy="4445418"/>
+                  <wp:extent cx="5334000" cy="4667602"/>
                   <wp:effectExtent b="0" l="0" r="0" t="0"/>
-                  <wp:docPr descr="" title="" id="24" name="Picture"/>
+                  <wp:docPr descr="" title="" id="23" name="Picture"/>
                   <a:graphic>
                     <a:graphicData uri="http://schemas.openxmlformats.org/drawingml/2006/picture">
                       <pic:pic>
                         <pic:nvPicPr>
-                          <pic:cNvPr descr="figures/overall_split_1.png" id="25" name="Picture"/>
+                          <pic:cNvPr descr="figures/usa_only.png" id="24" name="Picture"/>
                           <pic:cNvPicPr>
                             <a:picLocks noChangeArrowheads="1" noChangeAspect="1"/>
                           </pic:cNvPicPr>
                         </pic:nvPicPr>
                         <pic:blipFill>
-                          <a:blip r:embed="rId23"/>
+                          <a:blip r:embed="rId22"/>
+                          <a:stretch>
+                            <a:fillRect/>
+                          </a:stretch>
+                        </pic:blipFill>
+                        <pic:spPr bwMode="auto">
+                          <a:xfrm>
+                            <a:off x="0" y="0"/>
+                            <a:ext cx="5334000" cy="4667602"/>
+                          </a:xfrm>
+                          <a:prstGeom prst="rect">
+                            <a:avLst/>
+                          </a:prstGeom>
+                          <a:noFill/>
+                          <a:ln w="9525">
+                            <a:noFill/>
+                            <a:headEnd/>
+                            <a:tailEnd/>
+                          </a:ln>
+                        </pic:spPr>
+                      </pic:pic>
+                    </a:graphicData>
+                  </a:graphic>
+                </wp:inline>
+              </w:drawing>
+            </w:r>
+          </w:p>
+          <w:p>
+            <w:pPr>
+              <w:jc w:val="center"/>
+            </w:pPr>
+            <w:pPr>
+              <w:jc w:val="left"/>
+              <w:spacing w:before="200"/>
+              <w:pStyle w:val="ImageCaption"/>
+            </w:pPr>
+            <w:r>
+              <w:t xml:space="preserve">Figure 2: United States: ASFR surface with CPCFR contours at 2.05 (heavy) and 1.50 (light), cohorts observed to 2024.</w:t>
+            </w:r>
+          </w:p>
+          <w:bookmarkEnd w:id="25"/>
+        </w:tc>
+      </w:tr>
+    </w:tbl>
+    <w:p>
+      <w:pPr>
+        <w:pStyle w:val="BodyText"/>
+      </w:pPr>
+      <w:r>
+        <w:t xml:space="preserve">The United States requires a more careful statement (</w:t>
+      </w:r>
+      <w:hyperlink w:anchor="fig-usa">
+        <w:r>
+          <w:rPr>
+            <w:rStyle w:val="Hyperlink"/>
+          </w:rPr>
+          <w:t xml:space="preserve">Figure 2</w:t>
+        </w:r>
+      </w:hyperlink>
+      <w:r>
+        <w:t xml:space="preserve">). Its period TFR</w:t>
+      </w:r>
+      <w:r>
+        <w:t xml:space="preserve"> </w:t>
+      </w:r>
+      <w:r>
+        <w:t xml:space="preserve">fell from 2.12 (2007) to 1.59 (2024), a record low. In cohort terms, however, the</w:t>
+      </w:r>
+      <w:r>
+        <w:t xml:space="preserve"> </w:t>
+      </w:r>
+      <w:r>
+        <w:t xml:space="preserve">exception</w:t>
+      </w:r>
+      <w:r>
+        <w:t xml:space="preserve"> </w:t>
+      </w:r>
+      <w:r>
+        <w:rPr>
+          <w:i/>
+          <w:iCs/>
+        </w:rPr>
+        <w:t xml:space="preserve">persisted</w:t>
+      </w:r>
+      <w:r>
+        <w:t xml:space="preserve"> </w:t>
+      </w:r>
+      <w:r>
+        <w:t xml:space="preserve">longer than the period collapse suggests: cohorts born</w:t>
+      </w:r>
+      <w:r>
+        <w:t xml:space="preserve"> </w:t>
+      </w:r>
+      <w:r>
+        <w:t xml:space="preserve">1982, 1983 and 1984 all crossed CPCFR = 2.05, at ages 39, 39 and 40</w:t>
+      </w:r>
+      <w:r>
+        <w:t xml:space="preserve"> </w:t>
+      </w:r>
+      <w:r>
+        <w:t xml:space="preserve">respectively, with completed cumulative fertility of 2.14, 2.13 and 2.09. The</w:t>
+      </w:r>
+      <w:r>
+        <w:t xml:space="preserve"> </w:t>
+      </w:r>
+      <w:r>
+        <w:t xml:space="preserve">1985 cohort stood at 2.04 by age 39 (data to 2024) and will plausibly cross;</w:t>
+      </w:r>
+      <w:r>
+        <w:t xml:space="preserve"> </w:t>
+      </w:r>
+      <w:r>
+        <w:t xml:space="preserve">trajectories for cohorts born after the mid-1980s run progressively lower at</w:t>
+      </w:r>
+      <w:r>
+        <w:t xml:space="preserve"> </w:t>
+      </w:r>
+      <w:r>
+        <w:t xml:space="preserve">every age but remain right-censored. The US exception has thus not yet</w:t>
+      </w:r>
+      <w:r>
+        <w:t xml:space="preserve"> </w:t>
+      </w:r>
+      <w:r>
+        <w:t xml:space="preserve">collapsed in cohort terms; it is fading from below, cohort by cohort, exactly</w:t>
+      </w:r>
+      <w:r>
+        <w:t xml:space="preserve"> </w:t>
+      </w:r>
+      <w:r>
+        <w:t xml:space="preserve">as the period-based literature on postponement would predict</w:t>
+      </w:r>
+      <w:r>
+        <w:t xml:space="preserve"> </w:t>
+      </w:r>
+      <w:r>
+        <w:t xml:space="preserve">(Sobotka 2017; Kearney et al. 2022)</w:t>
+      </w:r>
+      <w:r>
+        <w:t xml:space="preserve">.</w:t>
+      </w:r>
+    </w:p>
+    <w:bookmarkEnd w:id="26"/>
+    <w:bookmarkStart w:id="31" w:name="the-panel-as-a-whole"/>
+    <w:p>
+      <w:pPr>
+        <w:pStyle w:val="Heading2"/>
+      </w:pPr>
+      <w:r>
+        <w:t xml:space="preserve">The panel as a whole</w:t>
+      </w:r>
+    </w:p>
+    <w:tbl>
+      <w:tblPr>
+        <w:tblStyle w:val="Table"/>
+        <w:tblW w:type="pct" w:w="5000"/>
+        <w:tblLayout w:type="fixed"/>
+        <w:tblLook w:firstRow="0" w:lastRow="0" w:firstColumn="0" w:lastColumn="0" w:noHBand="0" w:noVBand="0" w:val="0000"/>
+      </w:tblPr>
+      <w:tblGrid>
+        <w:gridCol w:w="7920"/>
+      </w:tblGrid>
+      <w:tr>
+        <w:tc>
+          <w:tcPr/>
+          <w:bookmarkStart w:id="30" w:name="fig-top15"/>
+          <w:p>
+            <w:pPr>
+              <w:pStyle w:val="Compact"/>
+              <w:jc w:val="center"/>
+            </w:pPr>
+            <w:r>
+              <w:drawing>
+                <wp:inline>
+                  <wp:extent cx="5334000" cy="4445418"/>
+                  <wp:effectExtent b="0" l="0" r="0" t="0"/>
+                  <wp:docPr descr="" title="" id="28" name="Picture"/>
+                  <a:graphic>
+                    <a:graphicData uri="http://schemas.openxmlformats.org/drawingml/2006/picture">
+                      <pic:pic>
+                        <pic:nvPicPr>
+                          <pic:cNvPr descr="figures/overall_split_1.png" id="29" name="Picture"/>
+                          <pic:cNvPicPr>
+                            <a:picLocks noChangeArrowheads="1" noChangeAspect="1"/>
+                          </pic:cNvPicPr>
+                        </pic:nvPicPr>
+                        <pic:blipFill>
+                          <a:blip r:embed="rId27"/>
                           <a:stretch>
                             <a:fillRect/>
                           </a:stretch>
@@ -1218,10 +1308,10 @@
               <w:pStyle w:val="ImageCaption"/>
             </w:pPr>
             <w:r>
-              <w:t xml:space="preserve">Figure 2: The fifteen highest-ranked countries by CPCFR at 2007, updated to 2023–25.</w:t>
+              <w:t xml:space="preserve">Figure 3: The fifteen highest-ranked countries by CPCFR at 2007, updated to 2023–25.</w:t>
             </w:r>
           </w:p>
-          <w:bookmarkEnd w:id="26"/>
+          <w:bookmarkEnd w:id="30"/>
         </w:tc>
       </w:tr>
     </w:tbl>
@@ -1264,19 +1354,105 @@
         <w:t xml:space="preserve"> </w:t>
       </w:r>
       <w:r>
-        <w:t xml:space="preserve">France 1980, New Zealand 1980. South Korea, newly covered here from 1960</w:t>
-      </w:r>
-      <w:r>
-        <w:t xml:space="preserve"> </w:t>
-      </w:r>
-      <w:r>
-        <w:t xml:space="preserve">(the 2020 panel’s Korean series ended in 2007), last saw a cohort reach</w:t>
-      </w:r>
-      <w:r>
-        <w:t xml:space="preserve"> </w:t>
-      </w:r>
-      <w:r>
-        <w:t xml:space="preserve">replacement with those born in 1958; its period TFR in 2024 was 0.75</w:t>
+        <w:t xml:space="preserve">France 1980, New Zealand 1980. Norway and the United States were therefore</w:t>
+      </w:r>
+      <w:r>
+        <w:t xml:space="preserve"> </w:t>
+      </w:r>
+      <w:r>
+        <w:t xml:space="preserve">never the</w:t>
+      </w:r>
+      <w:r>
+        <w:t xml:space="preserve"> </w:t>
+      </w:r>
+      <w:r>
+        <w:rPr>
+          <w:i/>
+          <w:iCs/>
+        </w:rPr>
+        <w:t xml:space="preserve">only</w:t>
+      </w:r>
+      <w:r>
+        <w:t xml:space="preserve"> </w:t>
+      </w:r>
+      <w:r>
+        <w:t xml:space="preserve">populations at or above replacement: Iceland, France, New</w:t>
+      </w:r>
+      <w:r>
+        <w:t xml:space="preserve"> </w:t>
+      </w:r>
+      <w:r>
+        <w:t xml:space="preserve">Zealand and Northern Ireland also saw cohorts born around 1980 cross the</w:t>
+      </w:r>
+      <w:r>
+        <w:t xml:space="preserve"> </w:t>
+      </w:r>
+      <w:r>
+        <w:t xml:space="preserve">milestone, as did several south-eastern European populations for cohorts born</w:t>
+      </w:r>
+      <w:r>
+        <w:t xml:space="preserve"> </w:t>
+      </w:r>
+      <w:r>
+        <w:t xml:space="preserve">into the mid-1970s (Macedonia 1974, Albania 1973). What made Norway and the</w:t>
+      </w:r>
+      <w:r>
+        <w:t xml:space="preserve"> </w:t>
+      </w:r>
+      <w:r>
+        <w:t xml:space="preserve">United States the named exceptions of the 2020 paper was narrower: among the</w:t>
+      </w:r>
+      <w:r>
+        <w:t xml:space="preserve"> </w:t>
+      </w:r>
+      <w:r>
+        <w:t xml:space="preserve">notably rich populations of the panel, they were the two whose cohort</w:t>
+      </w:r>
+      <w:r>
+        <w:t xml:space="preserve"> </w:t>
+      </w:r>
+      <w:r>
+        <w:t xml:space="preserve">fertility had</w:t>
+      </w:r>
+      <w:r>
+        <w:t xml:space="preserve"> </w:t>
+      </w:r>
+      <w:r>
+        <w:rPr>
+          <w:i/>
+          <w:iCs/>
+        </w:rPr>
+        <w:t xml:space="preserve">recovered</w:t>
+      </w:r>
+      <w:r>
+        <w:t xml:space="preserve"> </w:t>
+      </w:r>
+      <w:r>
+        <w:t xml:space="preserve">to replacement after earlier decline. It is that</w:t>
+      </w:r>
+      <w:r>
+        <w:t xml:space="preserve"> </w:t>
+      </w:r>
+      <w:r>
+        <w:t xml:space="preserve">recovery, specifically, that the new data shows ending. South Korea, newly</w:t>
+      </w:r>
+      <w:r>
+        <w:t xml:space="preserve"> </w:t>
+      </w:r>
+      <w:r>
+        <w:t xml:space="preserve">covered here from 1960 (the 2020 panel’s Korean series ended in 2007), last</w:t>
+      </w:r>
+      <w:r>
+        <w:t xml:space="preserve"> </w:t>
+      </w:r>
+      <w:r>
+        <w:t xml:space="preserve">saw a cohort reach replacement with those born in 1958; its period TFR in</w:t>
+      </w:r>
+      <w:r>
+        <w:t xml:space="preserve"> </w:t>
+      </w:r>
+      <w:r>
+        <w:t xml:space="preserve">2024 was 0.75</w:t>
       </w:r>
       <w:r>
         <w:t xml:space="preserve"> </w:t>
@@ -1288,9 +1464,9 @@
         <w:t xml:space="preserve">.</w:t>
       </w:r>
     </w:p>
-    <w:bookmarkEnd w:id="27"/>
-    <w:bookmarkEnd w:id="28"/>
-    <w:bookmarkStart w:id="31" w:name="conclusions"/>
+    <w:bookmarkEnd w:id="31"/>
+    <w:bookmarkEnd w:id="32"/>
+    <w:bookmarkStart w:id="35" w:name="conclusions"/>
     <w:p>
       <w:pPr>
         <w:pStyle w:val="Heading1"/>
@@ -1396,12 +1572,12 @@
                 <wp:inline>
                   <wp:extent cx="152400" cy="152400"/>
                   <wp:effectExtent b="0" l="0" r="0" t="0"/>
-                  <wp:docPr descr="" title="" id="29" name="Picture"/>
+                  <wp:docPr descr="" title="" id="33" name="Picture"/>
                   <a:graphic>
                     <a:graphicData uri="http://schemas.openxmlformats.org/drawingml/2006/picture">
                       <pic:pic>
                         <pic:nvPicPr>
-                          <pic:cNvPr descr="/Applications/quarto/share/formats/docx/note.png" id="30" name="Picture"/>
+                          <pic:cNvPr descr="/Applications/quarto/share/formats/docx/note.png" id="34" name="Picture"/>
                           <pic:cNvPicPr>
                             <a:picLocks noChangeArrowheads="1" noChangeAspect="1"/>
                           </pic:cNvPicPr>
@@ -1522,8 +1698,8 @@
         </w:tc>
       </w:tr>
     </w:tbl>
-    <w:bookmarkEnd w:id="31"/>
-    <w:bookmarkStart w:id="51" w:name="references"/>
+    <w:bookmarkEnd w:id="35"/>
+    <w:bookmarkStart w:id="55" w:name="references"/>
     <w:p>
       <w:pPr>
         <w:pStyle w:val="Heading1"/>
@@ -1532,8 +1708,8 @@
         <w:t xml:space="preserve">References</w:t>
       </w:r>
     </w:p>
-    <w:bookmarkStart w:id="50" w:name="refs"/>
-    <w:bookmarkStart w:id="33" w:name="ref-comolli2021"/>
+    <w:bookmarkStart w:id="54" w:name="refs"/>
+    <w:bookmarkStart w:id="37" w:name="ref-comolli2021"/>
     <w:p>
       <w:pPr>
         <w:pStyle w:val="Bibliography"/>
@@ -1578,7 +1754,7 @@
       <w:r>
         <w:t xml:space="preserve"> </w:t>
       </w:r>
-      <w:hyperlink r:id="rId32">
+      <w:hyperlink r:id="rId36">
         <w:r>
           <w:rPr>
             <w:rStyle w:val="Hyperlink"/>
@@ -1590,8 +1766,8 @@
         <w:t xml:space="preserve">.</w:t>
       </w:r>
     </w:p>
-    <w:bookmarkEnd w:id="33"/>
-    <w:bookmarkStart w:id="34" w:name="ref-garnier2018"/>
+    <w:bookmarkEnd w:id="37"/>
+    <w:bookmarkStart w:id="38" w:name="ref-garnier2018"/>
     <w:p>
       <w:pPr>
         <w:pStyle w:val="Bibliography"/>
@@ -1627,8 +1803,8 @@
         <w:t xml:space="preserve">.</w:t>
       </w:r>
     </w:p>
-    <w:bookmarkEnd w:id="34"/>
-    <w:bookmarkStart w:id="36" w:name="ref-hellstrand2020"/>
+    <w:bookmarkEnd w:id="38"/>
+    <w:bookmarkStart w:id="40" w:name="ref-hellstrand2020"/>
     <w:p>
       <w:pPr>
         <w:pStyle w:val="Bibliography"/>
@@ -1670,7 +1846,7 @@
       <w:r>
         <w:t xml:space="preserve"> </w:t>
       </w:r>
-      <w:hyperlink r:id="rId35">
+      <w:hyperlink r:id="rId39">
         <w:r>
           <w:rPr>
             <w:rStyle w:val="Hyperlink"/>
@@ -1682,8 +1858,8 @@
         <w:t xml:space="preserve">.</w:t>
       </w:r>
     </w:p>
-    <w:bookmarkEnd w:id="36"/>
-    <w:bookmarkStart w:id="38" w:name="ref-kearney2022"/>
+    <w:bookmarkEnd w:id="40"/>
+    <w:bookmarkStart w:id="42" w:name="ref-kearney2022"/>
     <w:p>
       <w:pPr>
         <w:pStyle w:val="Bibliography"/>
@@ -1725,7 +1901,7 @@
       <w:r>
         <w:t xml:space="preserve"> </w:t>
       </w:r>
-      <w:hyperlink r:id="rId37">
+      <w:hyperlink r:id="rId41">
         <w:r>
           <w:rPr>
             <w:rStyle w:val="Hyperlink"/>
@@ -1737,8 +1913,8 @@
         <w:t xml:space="preserve">.</w:t>
       </w:r>
     </w:p>
-    <w:bookmarkEnd w:id="38"/>
-    <w:bookmarkStart w:id="39" w:name="ref-kravdal2016"/>
+    <w:bookmarkEnd w:id="42"/>
+    <w:bookmarkStart w:id="43" w:name="ref-kravdal2016"/>
     <w:p>
       <w:pPr>
         <w:pStyle w:val="Bibliography"/>
@@ -1781,8 +1957,8 @@
         <w:t xml:space="preserve">, edited by Ronald R. Rindfuss and Minja Kim Choe. Springer.</w:t>
       </w:r>
     </w:p>
-    <w:bookmarkEnd w:id="39"/>
-    <w:bookmarkStart w:id="41" w:name="ref-hfc2026"/>
+    <w:bookmarkEnd w:id="43"/>
+    <w:bookmarkStart w:id="45" w:name="ref-hfc2026"/>
     <w:p>
       <w:pPr>
         <w:pStyle w:val="Bibliography"/>
@@ -1820,7 +1996,7 @@
       <w:r>
         <w:t xml:space="preserve"> </w:t>
       </w:r>
-      <w:hyperlink r:id="rId40">
+      <w:hyperlink r:id="rId44">
         <w:r>
           <w:rPr>
             <w:rStyle w:val="Hyperlink"/>
@@ -1832,8 +2008,8 @@
         <w:t xml:space="preserve">.</w:t>
       </w:r>
     </w:p>
-    <w:bookmarkEnd w:id="41"/>
-    <w:bookmarkStart w:id="43" w:name="ref-hfd2026"/>
+    <w:bookmarkEnd w:id="45"/>
+    <w:bookmarkStart w:id="47" w:name="ref-hfd2026"/>
     <w:p>
       <w:pPr>
         <w:pStyle w:val="Bibliography"/>
@@ -1871,7 +2047,7 @@
       <w:r>
         <w:t xml:space="preserve"> </w:t>
       </w:r>
-      <w:hyperlink r:id="rId42">
+      <w:hyperlink r:id="rId46">
         <w:r>
           <w:rPr>
             <w:rStyle w:val="Hyperlink"/>
@@ -1883,8 +2059,8 @@
         <w:t xml:space="preserve">.</w:t>
       </w:r>
     </w:p>
-    <w:bookmarkEnd w:id="43"/>
-    <w:bookmarkStart w:id="45" w:name="ref-pattaro2020"/>
+    <w:bookmarkEnd w:id="47"/>
+    <w:bookmarkStart w:id="49" w:name="ref-pattaro2020"/>
     <w:p>
       <w:pPr>
         <w:pStyle w:val="Bibliography"/>
@@ -1917,7 +2093,7 @@
       <w:r>
         <w:t xml:space="preserve"> </w:t>
       </w:r>
-      <w:hyperlink r:id="rId44">
+      <w:hyperlink r:id="rId48">
         <w:r>
           <w:rPr>
             <w:rStyle w:val="Hyperlink"/>
@@ -1929,8 +2105,8 @@
         <w:t xml:space="preserve">.</w:t>
       </w:r>
     </w:p>
-    <w:bookmarkEnd w:id="45"/>
-    <w:bookmarkStart w:id="46" w:name="ref-sarkar2008"/>
+    <w:bookmarkEnd w:id="49"/>
+    <w:bookmarkStart w:id="50" w:name="ref-sarkar2008"/>
     <w:p>
       <w:pPr>
         <w:pStyle w:val="Bibliography"/>
@@ -1952,8 +2128,8 @@
         <w:t xml:space="preserve">. Use r! Springer.</w:t>
       </w:r>
     </w:p>
-    <w:bookmarkEnd w:id="46"/>
-    <w:bookmarkStart w:id="47" w:name="ref-sobotka2017"/>
+    <w:bookmarkEnd w:id="50"/>
+    <w:bookmarkStart w:id="51" w:name="ref-sobotka2017"/>
     <w:p>
       <w:pPr>
         <w:pStyle w:val="Bibliography"/>
@@ -1984,8 +2160,8 @@
         <w:t xml:space="preserve">49 (S1): S20–45.</w:t>
       </w:r>
     </w:p>
-    <w:bookmarkEnd w:id="47"/>
-    <w:bookmarkStart w:id="49" w:name="ref-yoo2018"/>
+    <w:bookmarkEnd w:id="51"/>
+    <w:bookmarkStart w:id="53" w:name="ref-yoo2018"/>
     <w:p>
       <w:pPr>
         <w:pStyle w:val="Bibliography"/>
@@ -2027,7 +2203,7 @@
       <w:r>
         <w:t xml:space="preserve"> </w:t>
       </w:r>
-      <w:hyperlink r:id="rId48">
+      <w:hyperlink r:id="rId52">
         <w:r>
           <w:rPr>
             <w:rStyle w:val="Hyperlink"/>
@@ -2039,9 +2215,9 @@
         <w:t xml:space="preserve">.</w:t>
       </w:r>
     </w:p>
-    <w:bookmarkEnd w:id="49"/>
-    <w:bookmarkEnd w:id="50"/>
-    <w:bookmarkEnd w:id="51"/>
+    <w:bookmarkEnd w:id="53"/>
+    <w:bookmarkEnd w:id="54"/>
+    <w:bookmarkEnd w:id="55"/>
     <w:sectPr>
       <w:footnotePr>
         <w:numRestart w:val="eachSect"/>

</xml_diff>